<commit_message>
old modifications i hadnt commit
</commit_message>
<xml_diff>
--- a/MOINDJIE Daif Docker Containers Lab 1 Report.docx
+++ b/MOINDJIE Daif Docker Containers Lab 1 Report.docx
@@ -5,11 +5,12 @@
     <w:p>
       <w:pPr>
         <w:rPr>
-          <w:lang w:val="en-GB"/>
-        </w:rPr>
-      </w:pPr>
-      <w:r>
-        <w:rPr>
+          <w:lang w:val="fr-FR"/>
+        </w:rPr>
+      </w:pPr>
+      <w:r>
+        <w:rPr>
+          <w:noProof/>
           <w:lang w:val="en-GB"/>
         </w:rPr>
         <w:drawing>
@@ -77,20 +78,20 @@
       </w:r>
       <w:r>
         <w:rPr>
-          <w:lang w:val="en-GB"/>
+          <w:lang w:val="fr-FR"/>
         </w:rPr>
         <w:t>MOINDJIE Daïf</w:t>
       </w:r>
       <w:r>
         <w:rPr>
-          <w:lang w:val="en-GB"/>
+          <w:lang w:val="fr-FR"/>
         </w:rPr>
         <w:br/>
         <w:t>ING-2 IT-SE</w:t>
       </w:r>
       <w:r>
         <w:rPr>
-          <w:lang w:val="en-GB"/>
+          <w:lang w:val="fr-FR"/>
         </w:rPr>
         <w:br/>
         <w:t>18/09/2026</w:t>
@@ -99,70 +100,70 @@
     <w:p>
       <w:pPr>
         <w:rPr>
-          <w:lang w:val="en-GB"/>
-        </w:rPr>
-      </w:pPr>
-    </w:p>
-    <w:p>
-      <w:pPr>
-        <w:rPr>
-          <w:lang w:val="en-GB"/>
-        </w:rPr>
-      </w:pPr>
-    </w:p>
-    <w:p>
-      <w:pPr>
-        <w:rPr>
-          <w:lang w:val="en-GB"/>
-        </w:rPr>
-      </w:pPr>
-    </w:p>
-    <w:p>
-      <w:pPr>
-        <w:rPr>
-          <w:lang w:val="en-GB"/>
-        </w:rPr>
-      </w:pPr>
-    </w:p>
-    <w:p>
-      <w:pPr>
-        <w:rPr>
-          <w:lang w:val="en-GB"/>
-        </w:rPr>
-      </w:pPr>
-    </w:p>
-    <w:p>
-      <w:pPr>
-        <w:rPr>
-          <w:lang w:val="en-GB"/>
-        </w:rPr>
-      </w:pPr>
-    </w:p>
-    <w:p>
-      <w:pPr>
-        <w:rPr>
-          <w:lang w:val="en-GB"/>
-        </w:rPr>
-      </w:pPr>
-    </w:p>
-    <w:p>
-      <w:pPr>
-        <w:rPr>
-          <w:lang w:val="en-GB"/>
-        </w:rPr>
-      </w:pPr>
-    </w:p>
-    <w:p>
-      <w:pPr>
-        <w:rPr>
-          <w:lang w:val="en-GB"/>
-        </w:rPr>
-      </w:pPr>
-    </w:p>
-    <w:p>
-      <w:pPr>
-        <w:rPr>
-          <w:lang w:val="en-GB"/>
+          <w:lang w:val="fr-FR"/>
+        </w:rPr>
+      </w:pPr>
+    </w:p>
+    <w:p>
+      <w:pPr>
+        <w:rPr>
+          <w:lang w:val="fr-FR"/>
+        </w:rPr>
+      </w:pPr>
+    </w:p>
+    <w:p>
+      <w:pPr>
+        <w:rPr>
+          <w:lang w:val="fr-FR"/>
+        </w:rPr>
+      </w:pPr>
+    </w:p>
+    <w:p>
+      <w:pPr>
+        <w:rPr>
+          <w:lang w:val="fr-FR"/>
+        </w:rPr>
+      </w:pPr>
+    </w:p>
+    <w:p>
+      <w:pPr>
+        <w:rPr>
+          <w:lang w:val="fr-FR"/>
+        </w:rPr>
+      </w:pPr>
+    </w:p>
+    <w:p>
+      <w:pPr>
+        <w:rPr>
+          <w:lang w:val="fr-FR"/>
+        </w:rPr>
+      </w:pPr>
+    </w:p>
+    <w:p>
+      <w:pPr>
+        <w:rPr>
+          <w:lang w:val="fr-FR"/>
+        </w:rPr>
+      </w:pPr>
+    </w:p>
+    <w:p>
+      <w:pPr>
+        <w:rPr>
+          <w:lang w:val="fr-FR"/>
+        </w:rPr>
+      </w:pPr>
+    </w:p>
+    <w:p>
+      <w:pPr>
+        <w:rPr>
+          <w:lang w:val="fr-FR"/>
+        </w:rPr>
+      </w:pPr>
+    </w:p>
+    <w:p>
+      <w:pPr>
+        <w:rPr>
+          <w:lang w:val="fr-FR"/>
         </w:rPr>
       </w:pPr>
     </w:p>
@@ -307,6 +308,7 @@
       </w:pPr>
       <w:r>
         <w:rPr>
+          <w:noProof/>
           <w:lang w:val="en-GB"/>
         </w:rPr>
         <w:drawing>
@@ -373,6 +375,7 @@
       </w:pPr>
       <w:r>
         <w:rPr>
+          <w:noProof/>
           <w:sz w:val="22"/>
           <w:szCs w:val="22"/>
           <w:lang w:val="en-GB"/>
@@ -439,6 +442,7 @@
       </w:pPr>
       <w:r>
         <w:rPr>
+          <w:noProof/>
           <w:lang w:val="en-GB"/>
         </w:rPr>
         <w:drawing>
@@ -521,6 +525,7 @@
       </w:pPr>
       <w:r>
         <w:rPr>
+          <w:noProof/>
           <w:sz w:val="22"/>
           <w:szCs w:val="22"/>
           <w:lang w:val="en-GB"/>
@@ -595,6 +600,733 @@
           <w:lang w:val="en-GB"/>
         </w:rPr>
       </w:pPr>
+      <w:r>
+        <w:rPr>
+          <w:sz w:val="22"/>
+          <w:szCs w:val="22"/>
+          <w:lang w:val="en-GB"/>
+        </w:rPr>
+        <w:lastRenderedPageBreak/>
+        <w:drawing>
+          <wp:inline distT="0" distB="0" distL="0" distR="0" wp14:anchorId="737C6457" wp14:editId="477881B3">
+            <wp:extent cx="5760720" cy="3656965"/>
+            <wp:effectExtent l="0" t="0" r="0" b="635"/>
+            <wp:docPr id="2364367" name="Picture 1"/>
+            <wp:cNvGraphicFramePr>
+              <a:graphicFrameLocks xmlns:a="http://schemas.openxmlformats.org/drawingml/2006/main" noChangeAspect="1"/>
+            </wp:cNvGraphicFramePr>
+            <a:graphic xmlns:a="http://schemas.openxmlformats.org/drawingml/2006/main">
+              <a:graphicData uri="http://schemas.openxmlformats.org/drawingml/2006/picture">
+                <pic:pic xmlns:pic="http://schemas.openxmlformats.org/drawingml/2006/picture">
+                  <pic:nvPicPr>
+                    <pic:cNvPr id="2364367" name=""/>
+                    <pic:cNvPicPr/>
+                  </pic:nvPicPr>
+                  <pic:blipFill>
+                    <a:blip r:embed="rId10"/>
+                    <a:stretch>
+                      <a:fillRect/>
+                    </a:stretch>
+                  </pic:blipFill>
+                  <pic:spPr>
+                    <a:xfrm>
+                      <a:off x="0" y="0"/>
+                      <a:ext cx="5760720" cy="3656965"/>
+                    </a:xfrm>
+                    <a:prstGeom prst="rect">
+                      <a:avLst/>
+                    </a:prstGeom>
+                  </pic:spPr>
+                </pic:pic>
+              </a:graphicData>
+            </a:graphic>
+          </wp:inline>
+        </w:drawing>
+      </w:r>
+    </w:p>
+    <w:p>
+      <w:pPr>
+        <w:rPr>
+          <w:sz w:val="22"/>
+          <w:szCs w:val="22"/>
+          <w:lang w:val="en-GB"/>
+        </w:rPr>
+      </w:pPr>
+      <w:r>
+        <w:rPr>
+          <w:sz w:val="22"/>
+          <w:szCs w:val="22"/>
+          <w:lang w:val="en-GB"/>
+        </w:rPr>
+        <w:drawing>
+          <wp:inline distT="0" distB="0" distL="0" distR="0" wp14:anchorId="535CE6F1" wp14:editId="2E14925B">
+            <wp:extent cx="4020111" cy="3296110"/>
+            <wp:effectExtent l="0" t="0" r="0" b="0"/>
+            <wp:docPr id="905352562" name="Picture 1"/>
+            <wp:cNvGraphicFramePr>
+              <a:graphicFrameLocks xmlns:a="http://schemas.openxmlformats.org/drawingml/2006/main" noChangeAspect="1"/>
+            </wp:cNvGraphicFramePr>
+            <a:graphic xmlns:a="http://schemas.openxmlformats.org/drawingml/2006/main">
+              <a:graphicData uri="http://schemas.openxmlformats.org/drawingml/2006/picture">
+                <pic:pic xmlns:pic="http://schemas.openxmlformats.org/drawingml/2006/picture">
+                  <pic:nvPicPr>
+                    <pic:cNvPr id="905352562" name=""/>
+                    <pic:cNvPicPr/>
+                  </pic:nvPicPr>
+                  <pic:blipFill>
+                    <a:blip r:embed="rId11"/>
+                    <a:stretch>
+                      <a:fillRect/>
+                    </a:stretch>
+                  </pic:blipFill>
+                  <pic:spPr>
+                    <a:xfrm>
+                      <a:off x="0" y="0"/>
+                      <a:ext cx="4020111" cy="3296110"/>
+                    </a:xfrm>
+                    <a:prstGeom prst="rect">
+                      <a:avLst/>
+                    </a:prstGeom>
+                  </pic:spPr>
+                </pic:pic>
+              </a:graphicData>
+            </a:graphic>
+          </wp:inline>
+        </w:drawing>
+      </w:r>
+    </w:p>
+    <w:p>
+      <w:pPr>
+        <w:rPr>
+          <w:sz w:val="22"/>
+          <w:szCs w:val="22"/>
+          <w:lang w:val="en-GB"/>
+        </w:rPr>
+      </w:pPr>
+      <w:r>
+        <w:rPr>
+          <w:sz w:val="22"/>
+          <w:szCs w:val="22"/>
+          <w:lang w:val="en-GB"/>
+        </w:rPr>
+        <w:t>Persist data test:</w:t>
+      </w:r>
+    </w:p>
+    <w:p>
+      <w:pPr>
+        <w:rPr>
+          <w:sz w:val="22"/>
+          <w:szCs w:val="22"/>
+          <w:lang w:val="en-GB"/>
+        </w:rPr>
+      </w:pPr>
+      <w:r>
+        <w:rPr>
+          <w:sz w:val="22"/>
+          <w:szCs w:val="22"/>
+          <w:lang w:val="en-GB"/>
+        </w:rPr>
+        <w:lastRenderedPageBreak/>
+        <w:drawing>
+          <wp:inline distT="0" distB="0" distL="0" distR="0" wp14:anchorId="39ED0FAE" wp14:editId="4C1C04A6">
+            <wp:extent cx="5760720" cy="1645285"/>
+            <wp:effectExtent l="0" t="0" r="0" b="0"/>
+            <wp:docPr id="1033277910" name="Picture 1"/>
+            <wp:cNvGraphicFramePr>
+              <a:graphicFrameLocks xmlns:a="http://schemas.openxmlformats.org/drawingml/2006/main" noChangeAspect="1"/>
+            </wp:cNvGraphicFramePr>
+            <a:graphic xmlns:a="http://schemas.openxmlformats.org/drawingml/2006/main">
+              <a:graphicData uri="http://schemas.openxmlformats.org/drawingml/2006/picture">
+                <pic:pic xmlns:pic="http://schemas.openxmlformats.org/drawingml/2006/picture">
+                  <pic:nvPicPr>
+                    <pic:cNvPr id="1033277910" name=""/>
+                    <pic:cNvPicPr/>
+                  </pic:nvPicPr>
+                  <pic:blipFill>
+                    <a:blip r:embed="rId12"/>
+                    <a:stretch>
+                      <a:fillRect/>
+                    </a:stretch>
+                  </pic:blipFill>
+                  <pic:spPr>
+                    <a:xfrm>
+                      <a:off x="0" y="0"/>
+                      <a:ext cx="5760720" cy="1645285"/>
+                    </a:xfrm>
+                    <a:prstGeom prst="rect">
+                      <a:avLst/>
+                    </a:prstGeom>
+                  </pic:spPr>
+                </pic:pic>
+              </a:graphicData>
+            </a:graphic>
+          </wp:inline>
+        </w:drawing>
+      </w:r>
+    </w:p>
+    <w:p>
+      <w:pPr>
+        <w:rPr>
+          <w:sz w:val="22"/>
+          <w:szCs w:val="22"/>
+          <w:lang w:val="en-GB"/>
+        </w:rPr>
+      </w:pPr>
+      <w:r>
+        <w:rPr>
+          <w:sz w:val="22"/>
+          <w:szCs w:val="22"/>
+          <w:lang w:val="en-GB"/>
+        </w:rPr>
+        <w:drawing>
+          <wp:inline distT="0" distB="0" distL="0" distR="0" wp14:anchorId="07CE82EE" wp14:editId="60A58FA7">
+            <wp:extent cx="5760720" cy="1032510"/>
+            <wp:effectExtent l="0" t="0" r="0" b="0"/>
+            <wp:docPr id="1045464809" name="Picture 1"/>
+            <wp:cNvGraphicFramePr>
+              <a:graphicFrameLocks xmlns:a="http://schemas.openxmlformats.org/drawingml/2006/main" noChangeAspect="1"/>
+            </wp:cNvGraphicFramePr>
+            <a:graphic xmlns:a="http://schemas.openxmlformats.org/drawingml/2006/main">
+              <a:graphicData uri="http://schemas.openxmlformats.org/drawingml/2006/picture">
+                <pic:pic xmlns:pic="http://schemas.openxmlformats.org/drawingml/2006/picture">
+                  <pic:nvPicPr>
+                    <pic:cNvPr id="1045464809" name=""/>
+                    <pic:cNvPicPr/>
+                  </pic:nvPicPr>
+                  <pic:blipFill>
+                    <a:blip r:embed="rId13"/>
+                    <a:stretch>
+                      <a:fillRect/>
+                    </a:stretch>
+                  </pic:blipFill>
+                  <pic:spPr>
+                    <a:xfrm>
+                      <a:off x="0" y="0"/>
+                      <a:ext cx="5760720" cy="1032510"/>
+                    </a:xfrm>
+                    <a:prstGeom prst="rect">
+                      <a:avLst/>
+                    </a:prstGeom>
+                  </pic:spPr>
+                </pic:pic>
+              </a:graphicData>
+            </a:graphic>
+          </wp:inline>
+        </w:drawing>
+      </w:r>
+    </w:p>
+    <w:p>
+      <w:pPr>
+        <w:rPr>
+          <w:sz w:val="22"/>
+          <w:szCs w:val="22"/>
+          <w:lang w:val="en-GB"/>
+        </w:rPr>
+      </w:pPr>
+      <w:r>
+        <w:rPr>
+          <w:sz w:val="22"/>
+          <w:szCs w:val="22"/>
+          <w:lang w:val="en-GB"/>
+        </w:rPr>
+        <w:t>1-2: so that our data doesn’t get lost when we destroy our containers</w:t>
+      </w:r>
+    </w:p>
+    <w:p>
+      <w:pPr>
+        <w:rPr>
+          <w:sz w:val="22"/>
+          <w:szCs w:val="22"/>
+          <w:lang w:val="en-GB"/>
+        </w:rPr>
+      </w:pPr>
+      <w:r>
+        <w:rPr>
+          <w:sz w:val="22"/>
+          <w:szCs w:val="22"/>
+          <w:lang w:val="en-GB"/>
+        </w:rPr>
+        <w:t>1:3:</w:t>
+      </w:r>
+    </w:p>
+    <w:p>
+      <w:pPr>
+        <w:rPr>
+          <w:sz w:val="22"/>
+          <w:szCs w:val="22"/>
+        </w:rPr>
+      </w:pPr>
+      <w:r>
+        <w:rPr>
+          <w:sz w:val="22"/>
+          <w:szCs w:val="22"/>
+          <w:lang w:val="en-GB"/>
+        </w:rPr>
+        <w:t>Dockerfile:</w:t>
+      </w:r>
+      <w:r>
+        <w:rPr>
+          <w:sz w:val="22"/>
+          <w:szCs w:val="22"/>
+          <w:lang w:val="en-GB"/>
+        </w:rPr>
+        <w:br/>
+      </w:r>
+      <w:r>
+        <w:rPr>
+          <w:sz w:val="22"/>
+          <w:szCs w:val="22"/>
+        </w:rPr>
+        <w:t>FROM postgres:17.2-alpine</w:t>
+      </w:r>
+      <w:r>
+        <w:rPr>
+          <w:sz w:val="22"/>
+          <w:szCs w:val="22"/>
+        </w:rPr>
+        <w:br/>
+      </w:r>
+      <w:r>
+        <w:rPr>
+          <w:sz w:val="22"/>
+          <w:szCs w:val="22"/>
+        </w:rPr>
+        <w:br/>
+        <w:t xml:space="preserve">ENV </w:t>
+      </w:r>
+      <w:r>
+        <w:rPr>
+          <w:i/>
+          <w:iCs/>
+          <w:sz w:val="22"/>
+          <w:szCs w:val="22"/>
+        </w:rPr>
+        <w:t>POSTGRES_DB</w:t>
+      </w:r>
+      <w:r>
+        <w:rPr>
+          <w:sz w:val="22"/>
+          <w:szCs w:val="22"/>
+        </w:rPr>
+        <w:t>=</w:t>
+      </w:r>
+      <w:proofErr w:type="spellStart"/>
+      <w:r>
+        <w:rPr>
+          <w:sz w:val="22"/>
+          <w:szCs w:val="22"/>
+        </w:rPr>
+        <w:t>db</w:t>
+      </w:r>
+      <w:proofErr w:type="spellEnd"/>
+      <w:r>
+        <w:rPr>
+          <w:sz w:val="22"/>
+          <w:szCs w:val="22"/>
+        </w:rPr>
+        <w:t xml:space="preserve"> \</w:t>
+      </w:r>
+      <w:r>
+        <w:rPr>
+          <w:sz w:val="22"/>
+          <w:szCs w:val="22"/>
+        </w:rPr>
+        <w:br/>
+      </w:r>
+      <w:r>
+        <w:rPr>
+          <w:i/>
+          <w:iCs/>
+          <w:sz w:val="22"/>
+          <w:szCs w:val="22"/>
+        </w:rPr>
+        <w:t>POSTGRES_USER</w:t>
+      </w:r>
+      <w:r>
+        <w:rPr>
+          <w:sz w:val="22"/>
+          <w:szCs w:val="22"/>
+        </w:rPr>
+        <w:t>=</w:t>
+      </w:r>
+      <w:proofErr w:type="spellStart"/>
+      <w:r>
+        <w:rPr>
+          <w:sz w:val="22"/>
+          <w:szCs w:val="22"/>
+        </w:rPr>
+        <w:t>usr</w:t>
+      </w:r>
+      <w:proofErr w:type="spellEnd"/>
+      <w:r>
+        <w:rPr>
+          <w:sz w:val="22"/>
+          <w:szCs w:val="22"/>
+        </w:rPr>
+        <w:t xml:space="preserve"> \</w:t>
+      </w:r>
+      <w:r>
+        <w:rPr>
+          <w:sz w:val="22"/>
+          <w:szCs w:val="22"/>
+        </w:rPr>
+        <w:br/>
+      </w:r>
+      <w:r>
+        <w:rPr>
+          <w:i/>
+          <w:iCs/>
+          <w:sz w:val="22"/>
+          <w:szCs w:val="22"/>
+        </w:rPr>
+        <w:t>POSTGRES_PASSWORD</w:t>
+      </w:r>
+      <w:r>
+        <w:rPr>
+          <w:sz w:val="22"/>
+          <w:szCs w:val="22"/>
+        </w:rPr>
+        <w:t>=</w:t>
+      </w:r>
+      <w:proofErr w:type="spellStart"/>
+      <w:r>
+        <w:rPr>
+          <w:sz w:val="22"/>
+          <w:szCs w:val="22"/>
+        </w:rPr>
+        <w:t>pwd</w:t>
+      </w:r>
+      <w:proofErr w:type="spellEnd"/>
+      <w:r>
+        <w:rPr>
+          <w:sz w:val="22"/>
+          <w:szCs w:val="22"/>
+        </w:rPr>
+        <w:br/>
+      </w:r>
+      <w:r>
+        <w:rPr>
+          <w:sz w:val="22"/>
+          <w:szCs w:val="22"/>
+        </w:rPr>
+        <w:br/>
+        <w:t xml:space="preserve">COPY </w:t>
+      </w:r>
+      <w:proofErr w:type="spellStart"/>
+      <w:r>
+        <w:rPr>
+          <w:sz w:val="22"/>
+          <w:szCs w:val="22"/>
+        </w:rPr>
+        <w:t>CreateScheme.sql</w:t>
+      </w:r>
+      <w:proofErr w:type="spellEnd"/>
+      <w:r>
+        <w:rPr>
+          <w:sz w:val="22"/>
+          <w:szCs w:val="22"/>
+        </w:rPr>
+        <w:t xml:space="preserve"> /docker-</w:t>
+      </w:r>
+      <w:proofErr w:type="spellStart"/>
+      <w:r>
+        <w:rPr>
+          <w:sz w:val="22"/>
+          <w:szCs w:val="22"/>
+        </w:rPr>
+        <w:t>entrypoint</w:t>
+      </w:r>
+      <w:proofErr w:type="spellEnd"/>
+      <w:r>
+        <w:rPr>
+          <w:sz w:val="22"/>
+          <w:szCs w:val="22"/>
+        </w:rPr>
+        <w:t>-</w:t>
+      </w:r>
+      <w:proofErr w:type="spellStart"/>
+      <w:r>
+        <w:rPr>
+          <w:sz w:val="22"/>
+          <w:szCs w:val="22"/>
+        </w:rPr>
+        <w:t>initdb.d</w:t>
+      </w:r>
+      <w:proofErr w:type="spellEnd"/>
+      <w:r>
+        <w:rPr>
+          <w:sz w:val="22"/>
+          <w:szCs w:val="22"/>
+        </w:rPr>
+        <w:t>/01-create-scheme.sql</w:t>
+      </w:r>
+      <w:r>
+        <w:rPr>
+          <w:sz w:val="22"/>
+          <w:szCs w:val="22"/>
+        </w:rPr>
+        <w:br/>
+        <w:t xml:space="preserve">COPY </w:t>
+      </w:r>
+      <w:proofErr w:type="spellStart"/>
+      <w:r>
+        <w:rPr>
+          <w:sz w:val="22"/>
+          <w:szCs w:val="22"/>
+        </w:rPr>
+        <w:t>InsertData.sql</w:t>
+      </w:r>
+      <w:proofErr w:type="spellEnd"/>
+      <w:r>
+        <w:rPr>
+          <w:sz w:val="22"/>
+          <w:szCs w:val="22"/>
+        </w:rPr>
+        <w:t xml:space="preserve"> /docker-</w:t>
+      </w:r>
+      <w:proofErr w:type="spellStart"/>
+      <w:r>
+        <w:rPr>
+          <w:sz w:val="22"/>
+          <w:szCs w:val="22"/>
+        </w:rPr>
+        <w:t>entrypoint</w:t>
+      </w:r>
+      <w:proofErr w:type="spellEnd"/>
+      <w:r>
+        <w:rPr>
+          <w:sz w:val="22"/>
+          <w:szCs w:val="22"/>
+        </w:rPr>
+        <w:t>-</w:t>
+      </w:r>
+      <w:proofErr w:type="spellStart"/>
+      <w:r>
+        <w:rPr>
+          <w:sz w:val="22"/>
+          <w:szCs w:val="22"/>
+        </w:rPr>
+        <w:t>initdb.d</w:t>
+      </w:r>
+      <w:proofErr w:type="spellEnd"/>
+      <w:r>
+        <w:rPr>
+          <w:sz w:val="22"/>
+          <w:szCs w:val="22"/>
+        </w:rPr>
+        <w:t>/02-insert-data.sql</w:t>
+      </w:r>
+    </w:p>
+    <w:p>
+      <w:pPr>
+        <w:rPr>
+          <w:sz w:val="22"/>
+          <w:szCs w:val="22"/>
+        </w:rPr>
+      </w:pPr>
+    </w:p>
+    <w:p>
+      <w:pPr>
+        <w:rPr>
+          <w:sz w:val="22"/>
+          <w:szCs w:val="22"/>
+        </w:rPr>
+      </w:pPr>
+      <w:r>
+        <w:rPr>
+          <w:sz w:val="22"/>
+          <w:szCs w:val="22"/>
+        </w:rPr>
+        <w:t>Commands:</w:t>
+      </w:r>
+      <w:r>
+        <w:rPr>
+          <w:sz w:val="22"/>
+          <w:szCs w:val="22"/>
+        </w:rPr>
+        <w:br/>
+      </w:r>
+      <w:r>
+        <w:rPr>
+          <w:sz w:val="22"/>
+          <w:szCs w:val="22"/>
+        </w:rPr>
+        <w:drawing>
+          <wp:inline distT="0" distB="0" distL="0" distR="0" wp14:anchorId="360E8863" wp14:editId="3D5083DB">
+            <wp:extent cx="5760720" cy="225425"/>
+            <wp:effectExtent l="0" t="0" r="0" b="3175"/>
+            <wp:docPr id="115164942" name="Picture 1"/>
+            <wp:cNvGraphicFramePr>
+              <a:graphicFrameLocks xmlns:a="http://schemas.openxmlformats.org/drawingml/2006/main" noChangeAspect="1"/>
+            </wp:cNvGraphicFramePr>
+            <a:graphic xmlns:a="http://schemas.openxmlformats.org/drawingml/2006/main">
+              <a:graphicData uri="http://schemas.openxmlformats.org/drawingml/2006/picture">
+                <pic:pic xmlns:pic="http://schemas.openxmlformats.org/drawingml/2006/picture">
+                  <pic:nvPicPr>
+                    <pic:cNvPr id="115164942" name=""/>
+                    <pic:cNvPicPr/>
+                  </pic:nvPicPr>
+                  <pic:blipFill>
+                    <a:blip r:embed="rId14"/>
+                    <a:stretch>
+                      <a:fillRect/>
+                    </a:stretch>
+                  </pic:blipFill>
+                  <pic:spPr>
+                    <a:xfrm>
+                      <a:off x="0" y="0"/>
+                      <a:ext cx="5760720" cy="225425"/>
+                    </a:xfrm>
+                    <a:prstGeom prst="rect">
+                      <a:avLst/>
+                    </a:prstGeom>
+                  </pic:spPr>
+                </pic:pic>
+              </a:graphicData>
+            </a:graphic>
+          </wp:inline>
+        </w:drawing>
+      </w:r>
+      <w:r>
+        <w:rPr>
+          <w:sz w:val="22"/>
+          <w:szCs w:val="22"/>
+        </w:rPr>
+        <w:br/>
+      </w:r>
+      <w:r>
+        <w:rPr>
+          <w:sz w:val="22"/>
+          <w:szCs w:val="22"/>
+        </w:rPr>
+        <w:drawing>
+          <wp:inline distT="0" distB="0" distL="0" distR="0" wp14:anchorId="0B00D172" wp14:editId="032685DA">
+            <wp:extent cx="5760720" cy="1013460"/>
+            <wp:effectExtent l="0" t="0" r="0" b="0"/>
+            <wp:docPr id="1018356099" name="Picture 1"/>
+            <wp:cNvGraphicFramePr>
+              <a:graphicFrameLocks xmlns:a="http://schemas.openxmlformats.org/drawingml/2006/main" noChangeAspect="1"/>
+            </wp:cNvGraphicFramePr>
+            <a:graphic xmlns:a="http://schemas.openxmlformats.org/drawingml/2006/main">
+              <a:graphicData uri="http://schemas.openxmlformats.org/drawingml/2006/picture">
+                <pic:pic xmlns:pic="http://schemas.openxmlformats.org/drawingml/2006/picture">
+                  <pic:nvPicPr>
+                    <pic:cNvPr id="1018356099" name=""/>
+                    <pic:cNvPicPr/>
+                  </pic:nvPicPr>
+                  <pic:blipFill>
+                    <a:blip r:embed="rId15"/>
+                    <a:stretch>
+                      <a:fillRect/>
+                    </a:stretch>
+                  </pic:blipFill>
+                  <pic:spPr>
+                    <a:xfrm>
+                      <a:off x="0" y="0"/>
+                      <a:ext cx="5760720" cy="1013460"/>
+                    </a:xfrm>
+                    <a:prstGeom prst="rect">
+                      <a:avLst/>
+                    </a:prstGeom>
+                  </pic:spPr>
+                </pic:pic>
+              </a:graphicData>
+            </a:graphic>
+          </wp:inline>
+        </w:drawing>
+      </w:r>
+    </w:p>
+    <w:p>
+      <w:pPr>
+        <w:rPr>
+          <w:sz w:val="22"/>
+          <w:szCs w:val="22"/>
+        </w:rPr>
+      </w:pPr>
+    </w:p>
+    <w:p>
+      <w:pPr>
+        <w:pStyle w:val="Subtitle"/>
+      </w:pPr>
+      <w:r>
+        <w:t>Backend API</w:t>
+      </w:r>
+    </w:p>
+    <w:p>
+      <w:r>
+        <w:t>FROM eclipse-temurin:21-jre</w:t>
+      </w:r>
+      <w:r>
+        <w:br/>
+      </w:r>
+      <w:r>
+        <w:t xml:space="preserve">ADD </w:t>
+      </w:r>
+      <w:proofErr w:type="spellStart"/>
+      <w:r>
+        <w:t>Main.class</w:t>
+      </w:r>
+      <w:proofErr w:type="spellEnd"/>
+      <w:r>
+        <w:t xml:space="preserve"> .</w:t>
+      </w:r>
+      <w:r>
+        <w:br/>
+        <w:t>CMD ["java", "Main"]</w:t>
+      </w:r>
+    </w:p>
+    <w:p/>
+    <w:p>
+      <w:r>
+        <w:drawing>
+          <wp:inline distT="0" distB="0" distL="0" distR="0" wp14:anchorId="6CC72FD7" wp14:editId="5C995562">
+            <wp:extent cx="5760720" cy="401955"/>
+            <wp:effectExtent l="0" t="0" r="0" b="0"/>
+            <wp:docPr id="1933393106" name="Picture 1"/>
+            <wp:cNvGraphicFramePr>
+              <a:graphicFrameLocks xmlns:a="http://schemas.openxmlformats.org/drawingml/2006/main" noChangeAspect="1"/>
+            </wp:cNvGraphicFramePr>
+            <a:graphic xmlns:a="http://schemas.openxmlformats.org/drawingml/2006/main">
+              <a:graphicData uri="http://schemas.openxmlformats.org/drawingml/2006/picture">
+                <pic:pic xmlns:pic="http://schemas.openxmlformats.org/drawingml/2006/picture">
+                  <pic:nvPicPr>
+                    <pic:cNvPr id="1933393106" name=""/>
+                    <pic:cNvPicPr/>
+                  </pic:nvPicPr>
+                  <pic:blipFill>
+                    <a:blip r:embed="rId16"/>
+                    <a:stretch>
+                      <a:fillRect/>
+                    </a:stretch>
+                  </pic:blipFill>
+                  <pic:spPr>
+                    <a:xfrm>
+                      <a:off x="0" y="0"/>
+                      <a:ext cx="5760720" cy="401955"/>
+                    </a:xfrm>
+                    <a:prstGeom prst="rect">
+                      <a:avLst/>
+                    </a:prstGeom>
+                  </pic:spPr>
+                </pic:pic>
+              </a:graphicData>
+            </a:graphic>
+          </wp:inline>
+        </w:drawing>
+      </w:r>
+    </w:p>
+    <w:p>
+      <w:r>
+        <w:t xml:space="preserve">(changed terminal this time I’m using </w:t>
+      </w:r>
+      <w:proofErr w:type="spellStart"/>
+      <w:r>
+        <w:t>Intellij</w:t>
+      </w:r>
+      <w:proofErr w:type="spellEnd"/>
+      <w:r>
+        <w:t xml:space="preserve"> IDEA)</w:t>
+      </w:r>
     </w:p>
     <w:sectPr>
       <w:pgSz w:w="11906" w:h="16838"/>
@@ -1330,7 +2062,6 @@
   <w:style w:type="character" w:default="1" w:styleId="DefaultParagraphFont">
     <w:name w:val="Default Paragraph Font"/>
     <w:uiPriority w:val="1"/>
-    <w:semiHidden/>
     <w:unhideWhenUsed/>
   </w:style>
   <w:style w:type="table" w:default="1" w:styleId="TableNormal">
@@ -1642,6 +2373,36 @@
       <w:smallCaps/>
       <w:color w:val="0F4761" w:themeColor="accent1" w:themeShade="BF"/>
       <w:spacing w:val="5"/>
+    </w:rPr>
+  </w:style>
+  <w:style w:type="paragraph" w:styleId="HTMLPreformatted">
+    <w:name w:val="HTML Preformatted"/>
+    <w:basedOn w:val="Normal"/>
+    <w:link w:val="HTMLPreformattedChar"/>
+    <w:uiPriority w:val="99"/>
+    <w:semiHidden/>
+    <w:unhideWhenUsed/>
+    <w:rsid w:val="00F30CCF"/>
+    <w:pPr>
+      <w:spacing w:after="0" w:line="240" w:lineRule="auto"/>
+    </w:pPr>
+    <w:rPr>
+      <w:rFonts w:ascii="Consolas" w:hAnsi="Consolas"/>
+      <w:sz w:val="20"/>
+      <w:szCs w:val="20"/>
+    </w:rPr>
+  </w:style>
+  <w:style w:type="character" w:customStyle="1" w:styleId="HTMLPreformattedChar">
+    <w:name w:val="HTML Preformatted Char"/>
+    <w:basedOn w:val="DefaultParagraphFont"/>
+    <w:link w:val="HTMLPreformatted"/>
+    <w:uiPriority w:val="99"/>
+    <w:semiHidden/>
+    <w:rsid w:val="00F30CCF"/>
+    <w:rPr>
+      <w:rFonts w:ascii="Consolas" w:hAnsi="Consolas"/>
+      <w:sz w:val="20"/>
+      <w:szCs w:val="20"/>
     </w:rPr>
   </w:style>
 </w:styles>

</xml_diff>